<commit_message>
Update egypt-final to v1.5: 3B rebate to all covered industry, kernel v1.5 as Egypt_Model, retire obligations workbook
Co-Authored-By: Claude Sonnet 5.5 <noreply@anthropic.com>
Claude-Session: https://claude.ai/code/session_01MnaF19gSWzaMiztLqS74jT
</commit_message>
<xml_diff>
--- a/egypt-final/1_Summary.docx
+++ b/egypt-final/1_Summary.docx
@@ -348,12 +348,8 @@
             <w:pPr>
               <w:spacing w:after="0"/>
             </w:pPr>
-            <w:r/>
             <w:r>
-              <w:rPr>
-                <w:sz w:val="18"/>
-              </w:rPr>
-              <w:t>As 3A, but CBAM producers get free allowances per unit of output</w:t>
+              <w:t>As 3A, but all covered industry gets free allowances per unit of output</w:t>
             </w:r>
           </w:p>
         </w:tc>
@@ -824,12 +820,8 @@
               <w:spacing w:after="0"/>
               <w:jc w:val="center"/>
             </w:pPr>
-            <w:r/>
             <w:r>
-              <w:rPr>
-                <w:sz w:val="18"/>
-              </w:rPr>
-              <w:t>−19.1</w:t>
+              <w:t>−12.0</w:t>
             </w:r>
           </w:p>
         </w:tc>
@@ -951,12 +943,8 @@
               <w:spacing w:after="0"/>
               <w:jc w:val="center"/>
             </w:pPr>
-            <w:r/>
             <w:r>
-              <w:rPr>
-                <w:sz w:val="18"/>
-              </w:rPr>
-              <w:t>−3.2</w:t>
+              <w:t>−2.0</w:t>
             </w:r>
           </w:p>
         </w:tc>
@@ -1078,12 +1066,8 @@
               <w:spacing w:after="0"/>
               <w:jc w:val="center"/>
             </w:pPr>
-            <w:r/>
             <w:r>
-              <w:rPr>
-                <w:sz w:val="18"/>
-              </w:rPr>
-              <w:t>0.6</w:t>
+              <w:t>0.3</w:t>
             </w:r>
           </w:p>
         </w:tc>
@@ -1205,12 +1189,8 @@
               <w:spacing w:after="0"/>
               <w:jc w:val="center"/>
             </w:pPr>
-            <w:r/>
             <w:r>
-              <w:rPr>
-                <w:sz w:val="18"/>
-              </w:rPr>
-              <w:t>491</w:t>
+              <w:t>330</w:t>
             </w:r>
           </w:p>
         </w:tc>
@@ -1516,7 +1496,7 @@
         <w:spacing w:after="20"/>
       </w:pPr>
       <w:r>
-        <w:t>Pricing industry only (3A–3B) cuts less (19–23 Mt) and raises much less, because only part of industry was priced in the model run.</w:t>
+        <w:t>Pricing industry only (3A–3B) cuts less (12–23 Mt) and raises much less, because only part of industry was priced in the model run. In 3B the free allowances cover all covered industry, so net revenue is only about USD 0.3bn and the cut is the smallest.</w:t>
       </w:r>
     </w:p>
     <w:p>

</xml_diff>

<commit_message>
Final set v1.6: product-specific output elasticities (cement -0.10); documents on mirror numbers, kernel v1.6 and rebuild v0.5 builders drafted
Co-Authored-By: Claude Sonnet 5.5 <noreply@anthropic.com>
Claude-Session: https://claude.ai/code/session_01MnaF19gSWzaMiztLqS74jT
</commit_message>
<xml_diff>
--- a/egypt-final/1_Summary.docx
+++ b/egypt-final/1_Summary.docx
@@ -748,12 +748,8 @@
               <w:spacing w:after="0"/>
               <w:jc w:val="center"/>
             </w:pPr>
-            <w:r/>
             <w:r>
-              <w:rPr>
-                <w:sz w:val="18"/>
-              </w:rPr>
-              <w:t>−37.4</w:t>
+              <w:t>−34.7</w:t>
             </w:r>
           </w:p>
         </w:tc>
@@ -766,12 +762,8 @@
               <w:spacing w:after="0"/>
               <w:jc w:val="center"/>
             </w:pPr>
-            <w:r/>
             <w:r>
-              <w:rPr>
-                <w:sz w:val="18"/>
-              </w:rPr>
-              <w:t>−33.1</w:t>
+              <w:t>−31.9</w:t>
             </w:r>
           </w:p>
         </w:tc>
@@ -784,12 +776,8 @@
               <w:spacing w:after="0"/>
               <w:jc w:val="center"/>
             </w:pPr>
-            <w:r/>
             <w:r>
-              <w:rPr>
-                <w:sz w:val="18"/>
-              </w:rPr>
-              <w:t>−34.8</w:t>
+              <w:t>−33.7</w:t>
             </w:r>
           </w:p>
         </w:tc>
@@ -802,12 +790,8 @@
               <w:spacing w:after="0"/>
               <w:jc w:val="center"/>
             </w:pPr>
-            <w:r/>
             <w:r>
-              <w:rPr>
-                <w:sz w:val="18"/>
-              </w:rPr>
-              <w:t>−22.8</w:t>
+              <w:t>−20.0</w:t>
             </w:r>
           </w:p>
         </w:tc>
@@ -834,12 +818,8 @@
               <w:spacing w:after="0"/>
               <w:jc w:val="center"/>
             </w:pPr>
-            <w:r/>
             <w:r>
-              <w:rPr>
-                <w:sz w:val="18"/>
-              </w:rPr>
-              <w:t>−33.0</w:t>
+              <w:t>−30.8</w:t>
             </w:r>
           </w:p>
         </w:tc>
@@ -871,12 +851,8 @@
               <w:spacing w:after="0"/>
               <w:jc w:val="center"/>
             </w:pPr>
-            <w:r/>
             <w:r>
-              <w:rPr>
-                <w:sz w:val="18"/>
-              </w:rPr>
-              <w:t>−6.3</w:t>
+              <w:t>−5.8</w:t>
             </w:r>
           </w:p>
         </w:tc>
@@ -889,12 +865,8 @@
               <w:spacing w:after="0"/>
               <w:jc w:val="center"/>
             </w:pPr>
-            <w:r/>
             <w:r>
-              <w:rPr>
-                <w:sz w:val="18"/>
-              </w:rPr>
-              <w:t>−5.6</w:t>
+              <w:t>−5.4</w:t>
             </w:r>
           </w:p>
         </w:tc>
@@ -907,12 +879,8 @@
               <w:spacing w:after="0"/>
               <w:jc w:val="center"/>
             </w:pPr>
-            <w:r/>
             <w:r>
-              <w:rPr>
-                <w:sz w:val="18"/>
-              </w:rPr>
-              <w:t>−5.9</w:t>
+              <w:t>−5.7</w:t>
             </w:r>
           </w:p>
         </w:tc>
@@ -925,12 +893,8 @@
               <w:spacing w:after="0"/>
               <w:jc w:val="center"/>
             </w:pPr>
-            <w:r/>
             <w:r>
-              <w:rPr>
-                <w:sz w:val="18"/>
-              </w:rPr>
-              <w:t>−3.8</w:t>
+              <w:t>−3.4</w:t>
             </w:r>
           </w:p>
         </w:tc>
@@ -957,12 +921,8 @@
               <w:spacing w:after="0"/>
               <w:jc w:val="center"/>
             </w:pPr>
-            <w:r/>
             <w:r>
-              <w:rPr>
-                <w:sz w:val="18"/>
-              </w:rPr>
-              <w:t>−5.6</w:t>
+              <w:t>−5.2</w:t>
             </w:r>
           </w:p>
         </w:tc>
@@ -994,11 +954,7 @@
               <w:spacing w:after="0"/>
               <w:jc w:val="center"/>
             </w:pPr>
-            <w:r/>
             <w:r>
-              <w:rPr>
-                <w:sz w:val="18"/>
-              </w:rPr>
               <w:t>6.9</w:t>
             </w:r>
           </w:p>
@@ -1012,11 +968,7 @@
               <w:spacing w:after="0"/>
               <w:jc w:val="center"/>
             </w:pPr>
-            <w:r/>
             <w:r>
-              <w:rPr>
-                <w:sz w:val="18"/>
-              </w:rPr>
               <w:t>6.3</w:t>
             </w:r>
           </w:p>
@@ -1030,11 +982,7 @@
               <w:spacing w:after="0"/>
               <w:jc w:val="center"/>
             </w:pPr>
-            <w:r/>
             <w:r>
-              <w:rPr>
-                <w:sz w:val="18"/>
-              </w:rPr>
               <w:t>6.2</w:t>
             </w:r>
           </w:p>
@@ -1048,12 +996,8 @@
               <w:spacing w:after="0"/>
               <w:jc w:val="center"/>
             </w:pPr>
-            <w:r/>
             <w:r>
-              <w:rPr>
-                <w:sz w:val="18"/>
-              </w:rPr>
-              <w:t>1.5</w:t>
+              <w:t>1.6</w:t>
             </w:r>
           </w:p>
         </w:tc>
@@ -1080,11 +1024,7 @@
               <w:spacing w:after="0"/>
               <w:jc w:val="center"/>
             </w:pPr>
-            <w:r/>
             <w:r>
-              <w:rPr>
-                <w:sz w:val="18"/>
-              </w:rPr>
               <w:t>0.4</w:t>
             </w:r>
           </w:p>
@@ -1117,12 +1057,8 @@
               <w:spacing w:after="0"/>
               <w:jc w:val="center"/>
             </w:pPr>
-            <w:r/>
             <w:r>
-              <w:rPr>
-                <w:sz w:val="18"/>
-              </w:rPr>
-              <w:t>1,501</w:t>
+              <w:t>1,440</w:t>
             </w:r>
           </w:p>
         </w:tc>
@@ -1135,12 +1071,8 @@
               <w:spacing w:after="0"/>
               <w:jc w:val="center"/>
             </w:pPr>
-            <w:r/>
             <w:r>
-              <w:rPr>
-                <w:sz w:val="18"/>
-              </w:rPr>
-              <w:t>1,456</w:t>
+              <w:t>1,431</w:t>
             </w:r>
           </w:p>
         </w:tc>
@@ -1153,12 +1085,8 @@
               <w:spacing w:after="0"/>
               <w:jc w:val="center"/>
             </w:pPr>
-            <w:r/>
             <w:r>
-              <w:rPr>
-                <w:sz w:val="18"/>
-              </w:rPr>
-              <w:t>1,517</w:t>
+              <w:t>1,492</w:t>
             </w:r>
           </w:p>
         </w:tc>
@@ -1171,12 +1099,8 @@
               <w:spacing w:after="0"/>
               <w:jc w:val="center"/>
             </w:pPr>
-            <w:r/>
             <w:r>
-              <w:rPr>
-                <w:sz w:val="18"/>
-              </w:rPr>
-              <w:t>552</w:t>
+              <w:t>509</w:t>
             </w:r>
           </w:p>
         </w:tc>
@@ -1203,12 +1127,8 @@
               <w:spacing w:after="0"/>
               <w:jc w:val="center"/>
             </w:pPr>
-            <w:r/>
             <w:r>
-              <w:rPr>
-                <w:sz w:val="18"/>
-              </w:rPr>
-              <w:t>646</w:t>
+              <w:t>607</w:t>
             </w:r>
           </w:p>
         </w:tc>
@@ -1240,11 +1160,63 @@
               <w:spacing w:after="0"/>
               <w:jc w:val="center"/>
             </w:pPr>
-            <w:r/>
             <w:r>
-              <w:rPr>
-                <w:sz w:val="18"/>
-              </w:rPr>
+              <w:t>−5.7</w:t>
+            </w:r>
+          </w:p>
+        </w:tc>
+        <w:tc>
+          <w:tcPr>
+            <w:tcW w:type="dxa" w:w="1020"/>
+          </w:tcPr>
+          <w:p>
+            <w:pPr>
+              <w:spacing w:after="0"/>
+              <w:jc w:val="center"/>
+            </w:pPr>
+            <w:r>
+              <w:t>−2.1</w:t>
+            </w:r>
+          </w:p>
+        </w:tc>
+        <w:tc>
+          <w:tcPr>
+            <w:tcW w:type="dxa" w:w="1020"/>
+          </w:tcPr>
+          <w:p>
+            <w:pPr>
+              <w:spacing w:after="0"/>
+              <w:jc w:val="center"/>
+            </w:pPr>
+            <w:r>
+              <w:t>−2.2</w:t>
+            </w:r>
+          </w:p>
+        </w:tc>
+        <w:tc>
+          <w:tcPr>
+            <w:tcW w:type="dxa" w:w="1020"/>
+          </w:tcPr>
+          <w:p>
+            <w:pPr>
+              <w:spacing w:after="0"/>
+              <w:jc w:val="center"/>
+            </w:pPr>
+            <w:r>
+              <w:t>−5.7</w:t>
+            </w:r>
+          </w:p>
+        </w:tc>
+        <w:tc>
+          <w:tcPr>
+            <w:tcW w:type="dxa" w:w="1020"/>
+          </w:tcPr>
+          <w:p>
+            <w:pPr>
+              <w:spacing w:after="0"/>
+              <w:jc w:val="center"/>
+            </w:pPr>
+            <w:r>
               <w:t>−5.8</w:t>
             </w:r>
           </w:p>
@@ -1258,84 +1230,8 @@
               <w:spacing w:after="0"/>
               <w:jc w:val="center"/>
             </w:pPr>
-            <w:r/>
             <w:r>
-              <w:rPr>
-                <w:sz w:val="18"/>
-              </w:rPr>
-              <w:t>−2.1</w:t>
-            </w:r>
-          </w:p>
-        </w:tc>
-        <w:tc>
-          <w:tcPr>
-            <w:tcW w:type="dxa" w:w="1020"/>
-          </w:tcPr>
-          <w:p>
-            <w:pPr>
-              <w:spacing w:after="0"/>
-              <w:jc w:val="center"/>
-            </w:pPr>
-            <w:r/>
-            <w:r>
-              <w:rPr>
-                <w:sz w:val="18"/>
-              </w:rPr>
-              <w:t>−2.3</w:t>
-            </w:r>
-          </w:p>
-        </w:tc>
-        <w:tc>
-          <w:tcPr>
-            <w:tcW w:type="dxa" w:w="1020"/>
-          </w:tcPr>
-          <w:p>
-            <w:pPr>
-              <w:spacing w:after="0"/>
-              <w:jc w:val="center"/>
-            </w:pPr>
-            <w:r/>
-            <w:r>
-              <w:rPr>
-                <w:sz w:val="18"/>
-              </w:rPr>
-              <w:t>−5.8</w:t>
-            </w:r>
-          </w:p>
-        </w:tc>
-        <w:tc>
-          <w:tcPr>
-            <w:tcW w:type="dxa" w:w="1020"/>
-          </w:tcPr>
-          <w:p>
-            <w:pPr>
-              <w:spacing w:after="0"/>
-              <w:jc w:val="center"/>
-            </w:pPr>
-            <w:r/>
-            <w:r>
-              <w:rPr>
-                <w:sz w:val="18"/>
-              </w:rPr>
-              <w:t>−5.8</w:t>
-            </w:r>
-          </w:p>
-        </w:tc>
-        <w:tc>
-          <w:tcPr>
-            <w:tcW w:type="dxa" w:w="1020"/>
-          </w:tcPr>
-          <w:p>
-            <w:pPr>
-              <w:spacing w:after="0"/>
-              <w:jc w:val="center"/>
-            </w:pPr>
-            <w:r/>
-            <w:r>
-              <w:rPr>
-                <w:sz w:val="18"/>
-              </w:rPr>
-              <w:t>−23.1</w:t>
+              <w:t>−23.0</w:t>
             </w:r>
           </w:p>
         </w:tc>
@@ -1367,11 +1263,7 @@
               <w:spacing w:after="0"/>
               <w:jc w:val="center"/>
             </w:pPr>
-            <w:r/>
             <w:r>
-              <w:rPr>
-                <w:sz w:val="18"/>
-              </w:rPr>
               <w:t>−5.4</w:t>
             </w:r>
           </w:p>
@@ -1385,11 +1277,7 @@
               <w:spacing w:after="0"/>
               <w:jc w:val="center"/>
             </w:pPr>
-            <w:r/>
             <w:r>
-              <w:rPr>
-                <w:sz w:val="18"/>
-              </w:rPr>
               <w:t>−2.6</w:t>
             </w:r>
           </w:p>
@@ -1403,11 +1291,7 @@
               <w:spacing w:after="0"/>
               <w:jc w:val="center"/>
             </w:pPr>
-            <w:r/>
             <w:r>
-              <w:rPr>
-                <w:sz w:val="18"/>
-              </w:rPr>
               <w:t>−2.7</w:t>
             </w:r>
           </w:p>
@@ -1421,11 +1305,7 @@
               <w:spacing w:after="0"/>
               <w:jc w:val="center"/>
             </w:pPr>
-            <w:r/>
             <w:r>
-              <w:rPr>
-                <w:sz w:val="18"/>
-              </w:rPr>
               <w:t>−5.4</w:t>
             </w:r>
           </w:p>
@@ -1439,11 +1319,7 @@
               <w:spacing w:after="0"/>
               <w:jc w:val="center"/>
             </w:pPr>
-            <w:r/>
             <w:r>
-              <w:rPr>
-                <w:sz w:val="18"/>
-              </w:rPr>
               <w:t>−5.4</w:t>
             </w:r>
           </w:p>
@@ -1457,11 +1333,7 @@
               <w:spacing w:after="0"/>
               <w:jc w:val="center"/>
             </w:pPr>
-            <w:r/>
             <w:r>
-              <w:rPr>
-                <w:sz w:val="18"/>
-              </w:rPr>
               <w:t>−20.7</w:t>
             </w:r>
           </w:p>
@@ -1487,7 +1359,7 @@
         <w:spacing w:after="20"/>
       </w:pPr>
       <w:r>
-        <w:t>Pricing all energy (1A–2B) cuts emissions by about 33–37 Mt, around 6% of national emissions, and raises USD 6–7bn.</w:t>
+        <w:t>Pricing all energy (1A–2B) cuts emissions by about 32–35 Mt, around 5–6% of national emissions, and raises USD 6–7bn.</w:t>
       </w:r>
     </w:p>
     <w:p>
@@ -1496,7 +1368,7 @@
         <w:spacing w:after="20"/>
       </w:pPr>
       <w:r>
-        <w:t>Pricing industry only (3A–3B) cuts less (12–23 Mt) and raises much less, because only part of industry was priced in the model run. In 3B the free allowances cover all covered industry, so net revenue is only about USD 0.3bn and the cut is the smallest.</w:t>
+        <w:t>Pricing industry only (3A–3B) cuts less (12–20 Mt) and raises much less, because only part of industry was priced in the model run. In 3B the free allowances cover all covered industry, so net revenue is only about USD 0.3bn and the cut is the smallest.</w:t>
       </w:r>
     </w:p>
     <w:p>
@@ -1609,7 +1481,7 @@
         <w:spacing w:after="20"/>
       </w:pPr>
       <w:r>
-        <w:t>Output falls by 0.5% for every 1% rise in net cost. This is a placeholder.</w:t>
+        <w:t>Output falls by 0.1% (cement) to 0.5% (aluminium) for every 1% rise in net cost. These are judgements from the literature; only cement matters.</w:t>
       </w:r>
     </w:p>
     <w:p>

</xml_diff>

<commit_message>
Finalise v1.6 documents on live kernel results; rebuild v0.5 notes; bookkeeping
Co-Authored-By: Claude Sonnet 5.5 <noreply@anthropic.com>
Claude-Session: https://claude.ai/code/session_01MnaF19gSWzaMiztLqS74jT
</commit_message>
<xml_diff>
--- a/egypt-final/1_Summary.docx
+++ b/egypt-final/1_Summary.docx
@@ -1128,7 +1128,7 @@
               <w:jc w:val="center"/>
             </w:pPr>
             <w:r>
-              <w:t>607</w:t>
+              <w:t>606</w:t>
             </w:r>
           </w:p>
         </w:tc>
@@ -1161,7 +1161,7 @@
               <w:jc w:val="center"/>
             </w:pPr>
             <w:r>
-              <w:t>−5.7</w:t>
+              <w:t>−5.8</w:t>
             </w:r>
           </w:p>
         </w:tc>
@@ -1189,21 +1189,7 @@
               <w:jc w:val="center"/>
             </w:pPr>
             <w:r>
-              <w:t>−2.2</w:t>
-            </w:r>
-          </w:p>
-        </w:tc>
-        <w:tc>
-          <w:tcPr>
-            <w:tcW w:type="dxa" w:w="1020"/>
-          </w:tcPr>
-          <w:p>
-            <w:pPr>
-              <w:spacing w:after="0"/>
-              <w:jc w:val="center"/>
-            </w:pPr>
-            <w:r>
-              <w:t>−5.7</w:t>
+              <w:t>−2.3</w:t>
             </w:r>
           </w:p>
         </w:tc>
@@ -1231,7 +1217,21 @@
               <w:jc w:val="center"/>
             </w:pPr>
             <w:r>
-              <w:t>−23.0</w:t>
+              <w:t>−5.8</w:t>
+            </w:r>
+          </w:p>
+        </w:tc>
+        <w:tc>
+          <w:tcPr>
+            <w:tcW w:type="dxa" w:w="1020"/>
+          </w:tcPr>
+          <w:p>
+            <w:pPr>
+              <w:spacing w:after="0"/>
+              <w:jc w:val="center"/>
+            </w:pPr>
+            <w:r>
+              <w:t>−23.1</w:t>
             </w:r>
           </w:p>
         </w:tc>

</xml_diff>